<commit_message>
Course plan: drop course code and semester, add Master of Science heading
Co-Authored-By: Claude Opus 5.5 <noreply@anthropic.com>
Claude-Session: https://claude.ai/code/session_01Hy1NCTkkcfUJLKZg2hmDiP
</commit_message>
<xml_diff>
--- a/CS2101/Course_Plan_CS2101.docx
+++ b/CS2101/Course_Plan_CS2101.docx
@@ -17,25 +17,25 @@
       <w:r>
         <w:rPr>
           <w:b/>
-          <w:sz w:val="36"/>
+          <w:sz w:val="32"/>
           <w:u w:val="none"/>
         </w:rPr>
-        <w:t>COURSE PLAN</w:t>
+        <w:t>MASTER OF SCIENCE</w:t>
       </w:r>
     </w:p>
     <w:p>
       <w:pPr>
         <w:keepNext w:val="0"/>
-        <w:spacing w:before="0" w:after="120"/>
+        <w:spacing w:before="0" w:after="160"/>
         <w:jc w:val="center"/>
       </w:pPr>
       <w:r>
         <w:rPr>
           <w:b/>
-          <w:sz w:val="44"/>
+          <w:sz w:val="36"/>
           <w:u w:val="none"/>
         </w:rPr>
-        <w:t>DISCRETE MATHEMATICAL STRUCTURES (CS2101)</w:t>
+        <w:t>COURSE PLAN</w:t>
       </w:r>
     </w:p>
     <w:p>
@@ -46,11 +46,11 @@
       </w:pPr>
       <w:r>
         <w:rPr>
-          <w:b w:val="0"/>
-          <w:sz w:val="24"/>
+          <w:b/>
+          <w:sz w:val="44"/>
           <w:u w:val="none"/>
         </w:rPr>
-        <w:t>II Year – I Semester</w:t>
+        <w:t>DISCRETE MATHEMATICAL STRUCTURES</w:t>
       </w:r>
     </w:p>
     <w:p>
@@ -119,6 +119,21 @@
     <w:p>
       <w:pPr>
         <w:keepNext w:val="0"/>
+        <w:spacing w:before="0" w:after="80"/>
+        <w:jc w:val="center"/>
+      </w:pPr>
+      <w:r>
+        <w:rPr>
+          <w:b/>
+          <w:sz w:val="26"/>
+          <w:u w:val="none"/>
+        </w:rPr>
+        <w:t>MASTER OF SCIENCE</w:t>
+      </w:r>
+    </w:p>
+    <w:p>
+      <w:pPr>
+        <w:keepNext w:val="0"/>
         <w:spacing w:before="0" w:after="120"/>
         <w:jc w:val="center"/>
       </w:pPr>
@@ -143,7 +158,7 @@
           <w:sz w:val="23"/>
           <w:u w:val="single"/>
         </w:rPr>
-        <w:t>DISCRETE MATHEMATICAL STRUCTURES (CS2101)</w:t>
+        <w:t>DISCRETE MATHEMATICAL STRUCTURES</w:t>
       </w:r>
     </w:p>
     <w:p>
@@ -151,20 +166,6 @@
         <w:keepNext w:val="0"/>
         <w:spacing w:before="0" w:after="40"/>
       </w:pPr>
-      <w:r>
-        <w:rPr>
-          <w:b/>
-          <w:sz w:val="19"/>
-        </w:rPr>
-        <w:t xml:space="preserve">Class: </w:t>
-      </w:r>
-      <w:r>
-        <w:rPr>
-          <w:b w:val="0"/>
-          <w:sz w:val="19"/>
-        </w:rPr>
-        <w:t xml:space="preserve">II Year – I Semester   |   </w:t>
-      </w:r>
       <w:r>
         <w:rPr>
           <w:b/>

</xml_diff>

<commit_message>
Add Blockchain Technology course plan (Word + PDF)
Unit-wise plan for 45 hours in the same format as the CS2101 plan.
Also keep table header rows with their first data row in the Word
output so headings are not stranded at page bottoms.

Co-Authored-By: Claude Opus 5.5 <noreply@anthropic.com>
Claude-Session: https://claude.ai/code/session_01Hy1NCTkkcfUJLKZg2hmDiP
</commit_message>
<xml_diff>
--- a/CS2101/Course_Plan_CS2101.docx
+++ b/CS2101/Course_Plan_CS2101.docx
@@ -265,6 +265,7 @@
           </w:tcPr>
           <w:p>
             <w:pPr>
+              <w:keepNext/>
               <w:jc w:val="center"/>
             </w:pPr>
             <w:r>
@@ -283,6 +284,9 @@
             <w:shd w:val="clear" w:color="auto" w:fill="E6E6E6"/>
           </w:tcPr>
           <w:p>
+            <w:pPr>
+              <w:keepNext/>
+            </w:pPr>
             <w:r>
               <w:rPr>
                 <w:b/>
@@ -300,6 +304,7 @@
           </w:tcPr>
           <w:p>
             <w:pPr>
+              <w:keepNext/>
               <w:jc w:val="center"/>
             </w:pPr>
             <w:r>
@@ -318,6 +323,9 @@
             <w:shd w:val="clear" w:color="auto" w:fill="E6E6E6"/>
           </w:tcPr>
           <w:p>
+            <w:pPr>
+              <w:keepNext/>
+            </w:pPr>
             <w:r>
               <w:rPr>
                 <w:b/>
@@ -334,6 +342,9 @@
             <w:shd w:val="clear" w:color="auto" w:fill="E6E6E6"/>
           </w:tcPr>
           <w:p>
+            <w:pPr>
+              <w:keepNext/>
+            </w:pPr>
             <w:r>
               <w:rPr>
                 <w:b/>
@@ -355,6 +366,7 @@
           </w:tcPr>
           <w:p>
             <w:pPr>
+              <w:keepNext w:val="0"/>
               <w:jc w:val="center"/>
             </w:pPr>
             <w:r>
@@ -372,6 +384,9 @@
             <w:vAlign w:val="center"/>
           </w:tcPr>
           <w:p>
+            <w:pPr>
+              <w:keepNext w:val="0"/>
+            </w:pPr>
             <w:r>
               <w:rPr>
                 <w:b w:val="0"/>
@@ -388,6 +403,7 @@
           </w:tcPr>
           <w:p>
             <w:pPr>
+              <w:keepNext w:val="0"/>
               <w:jc w:val="center"/>
             </w:pPr>
             <w:r>
@@ -405,6 +421,9 @@
             <w:vAlign w:val="center"/>
           </w:tcPr>
           <w:p>
+            <w:pPr>
+              <w:keepNext w:val="0"/>
+            </w:pPr>
             <w:r>
               <w:rPr>
                 <w:b w:val="0"/>
@@ -420,6 +439,9 @@
             <w:vAlign w:val="center"/>
           </w:tcPr>
           <w:p>
+            <w:pPr>
+              <w:keepNext w:val="0"/>
+            </w:pPr>
             <w:r>
               <w:rPr>
                 <w:b w:val="0"/>
@@ -441,6 +463,7 @@
           </w:tcPr>
           <w:p>
             <w:pPr>
+              <w:keepNext w:val="0"/>
               <w:jc w:val="center"/>
             </w:pPr>
             <w:r>
@@ -458,6 +481,9 @@
             <w:vAlign w:val="center"/>
           </w:tcPr>
           <w:p>
+            <w:pPr>
+              <w:keepNext w:val="0"/>
+            </w:pPr>
             <w:r>
               <w:rPr>
                 <w:b w:val="0"/>
@@ -474,6 +500,7 @@
           </w:tcPr>
           <w:p>
             <w:pPr>
+              <w:keepNext w:val="0"/>
               <w:jc w:val="center"/>
             </w:pPr>
             <w:r>
@@ -491,6 +518,9 @@
             <w:vAlign w:val="center"/>
           </w:tcPr>
           <w:p>
+            <w:pPr>
+              <w:keepNext w:val="0"/>
+            </w:pPr>
             <w:r>
               <w:rPr>
                 <w:b w:val="0"/>
@@ -506,6 +536,9 @@
             <w:vAlign w:val="center"/>
           </w:tcPr>
           <w:p>
+            <w:pPr>
+              <w:keepNext w:val="0"/>
+            </w:pPr>
             <w:r>
               <w:rPr>
                 <w:b w:val="0"/>
@@ -527,6 +560,7 @@
           </w:tcPr>
           <w:p>
             <w:pPr>
+              <w:keepNext w:val="0"/>
               <w:jc w:val="center"/>
             </w:pPr>
             <w:r>
@@ -544,6 +578,9 @@
             <w:vAlign w:val="center"/>
           </w:tcPr>
           <w:p>
+            <w:pPr>
+              <w:keepNext w:val="0"/>
+            </w:pPr>
             <w:r>
               <w:rPr>
                 <w:b w:val="0"/>
@@ -560,6 +597,7 @@
           </w:tcPr>
           <w:p>
             <w:pPr>
+              <w:keepNext w:val="0"/>
               <w:jc w:val="center"/>
             </w:pPr>
             <w:r>
@@ -577,6 +615,9 @@
             <w:vAlign w:val="center"/>
           </w:tcPr>
           <w:p>
+            <w:pPr>
+              <w:keepNext w:val="0"/>
+            </w:pPr>
             <w:r>
               <w:rPr>
                 <w:b w:val="0"/>
@@ -592,6 +633,9 @@
             <w:vAlign w:val="center"/>
           </w:tcPr>
           <w:p>
+            <w:pPr>
+              <w:keepNext w:val="0"/>
+            </w:pPr>
             <w:r>
               <w:rPr>
                 <w:b w:val="0"/>
@@ -613,6 +657,7 @@
           </w:tcPr>
           <w:p>
             <w:pPr>
+              <w:keepNext w:val="0"/>
               <w:jc w:val="center"/>
             </w:pPr>
             <w:r>
@@ -630,6 +675,9 @@
             <w:vAlign w:val="center"/>
           </w:tcPr>
           <w:p>
+            <w:pPr>
+              <w:keepNext w:val="0"/>
+            </w:pPr>
             <w:r>
               <w:rPr>
                 <w:b w:val="0"/>
@@ -646,6 +694,7 @@
           </w:tcPr>
           <w:p>
             <w:pPr>
+              <w:keepNext w:val="0"/>
               <w:jc w:val="center"/>
             </w:pPr>
             <w:r>
@@ -663,6 +712,9 @@
             <w:vAlign w:val="center"/>
           </w:tcPr>
           <w:p>
+            <w:pPr>
+              <w:keepNext w:val="0"/>
+            </w:pPr>
             <w:r>
               <w:rPr>
                 <w:b w:val="0"/>
@@ -678,6 +730,9 @@
             <w:vAlign w:val="center"/>
           </w:tcPr>
           <w:p>
+            <w:pPr>
+              <w:keepNext w:val="0"/>
+            </w:pPr>
             <w:r>
               <w:rPr>
                 <w:b w:val="0"/>
@@ -699,6 +754,7 @@
           </w:tcPr>
           <w:p>
             <w:pPr>
+              <w:keepNext w:val="0"/>
               <w:jc w:val="center"/>
             </w:pPr>
             <w:r>
@@ -716,6 +772,9 @@
             <w:vAlign w:val="center"/>
           </w:tcPr>
           <w:p>
+            <w:pPr>
+              <w:keepNext w:val="0"/>
+            </w:pPr>
             <w:r>
               <w:rPr>
                 <w:b w:val="0"/>
@@ -732,6 +791,7 @@
           </w:tcPr>
           <w:p>
             <w:pPr>
+              <w:keepNext w:val="0"/>
               <w:jc w:val="center"/>
             </w:pPr>
             <w:r>
@@ -749,6 +809,9 @@
             <w:vAlign w:val="center"/>
           </w:tcPr>
           <w:p>
+            <w:pPr>
+              <w:keepNext w:val="0"/>
+            </w:pPr>
             <w:r>
               <w:rPr>
                 <w:b w:val="0"/>
@@ -764,6 +827,9 @@
             <w:vAlign w:val="center"/>
           </w:tcPr>
           <w:p>
+            <w:pPr>
+              <w:keepNext w:val="0"/>
+            </w:pPr>
             <w:r>
               <w:rPr>
                 <w:b w:val="0"/>
@@ -785,6 +851,7 @@
           </w:tcPr>
           <w:p>
             <w:pPr>
+              <w:keepNext w:val="0"/>
               <w:jc w:val="center"/>
             </w:pPr>
             <w:r>
@@ -802,6 +869,9 @@
             <w:vAlign w:val="center"/>
           </w:tcPr>
           <w:p>
+            <w:pPr>
+              <w:keepNext w:val="0"/>
+            </w:pPr>
             <w:r>
               <w:rPr>
                 <w:b w:val="0"/>
@@ -818,6 +888,7 @@
           </w:tcPr>
           <w:p>
             <w:pPr>
+              <w:keepNext w:val="0"/>
               <w:jc w:val="center"/>
             </w:pPr>
             <w:r>
@@ -835,6 +906,9 @@
             <w:vAlign w:val="center"/>
           </w:tcPr>
           <w:p>
+            <w:pPr>
+              <w:keepNext w:val="0"/>
+            </w:pPr>
             <w:r>
               <w:rPr>
                 <w:b w:val="0"/>
@@ -850,6 +924,9 @@
             <w:vAlign w:val="center"/>
           </w:tcPr>
           <w:p>
+            <w:pPr>
+              <w:keepNext w:val="0"/>
+            </w:pPr>
             <w:r>
               <w:rPr>
                 <w:b w:val="0"/>
@@ -871,6 +948,7 @@
           </w:tcPr>
           <w:p>
             <w:pPr>
+              <w:keepNext w:val="0"/>
               <w:jc w:val="center"/>
             </w:pPr>
             <w:r>
@@ -888,6 +966,9 @@
             <w:vAlign w:val="center"/>
           </w:tcPr>
           <w:p>
+            <w:pPr>
+              <w:keepNext w:val="0"/>
+            </w:pPr>
             <w:r>
               <w:rPr>
                 <w:b w:val="0"/>
@@ -904,6 +985,7 @@
           </w:tcPr>
           <w:p>
             <w:pPr>
+              <w:keepNext w:val="0"/>
               <w:jc w:val="center"/>
             </w:pPr>
             <w:r>
@@ -921,6 +1003,9 @@
             <w:vAlign w:val="center"/>
           </w:tcPr>
           <w:p>
+            <w:pPr>
+              <w:keepNext w:val="0"/>
+            </w:pPr>
             <w:r>
               <w:rPr>
                 <w:b w:val="0"/>
@@ -936,6 +1021,9 @@
             <w:vAlign w:val="center"/>
           </w:tcPr>
           <w:p>
+            <w:pPr>
+              <w:keepNext w:val="0"/>
+            </w:pPr>
             <w:r>
               <w:rPr>
                 <w:b w:val="0"/>
@@ -957,6 +1045,7 @@
           </w:tcPr>
           <w:p>
             <w:pPr>
+              <w:keepNext w:val="0"/>
               <w:jc w:val="center"/>
             </w:pPr>
             <w:r>
@@ -974,6 +1063,9 @@
             <w:vAlign w:val="center"/>
           </w:tcPr>
           <w:p>
+            <w:pPr>
+              <w:keepNext w:val="0"/>
+            </w:pPr>
             <w:r>
               <w:rPr>
                 <w:b w:val="0"/>
@@ -990,6 +1082,7 @@
           </w:tcPr>
           <w:p>
             <w:pPr>
+              <w:keepNext w:val="0"/>
               <w:jc w:val="center"/>
             </w:pPr>
             <w:r>
@@ -1007,6 +1100,9 @@
             <w:vAlign w:val="center"/>
           </w:tcPr>
           <w:p>
+            <w:pPr>
+              <w:keepNext w:val="0"/>
+            </w:pPr>
             <w:r>
               <w:rPr>
                 <w:b w:val="0"/>
@@ -1022,6 +1118,9 @@
             <w:vAlign w:val="center"/>
           </w:tcPr>
           <w:p>
+            <w:pPr>
+              <w:keepNext w:val="0"/>
+            </w:pPr>
             <w:r>
               <w:rPr>
                 <w:b w:val="0"/>
@@ -1043,6 +1142,7 @@
           </w:tcPr>
           <w:p>
             <w:pPr>
+              <w:keepNext w:val="0"/>
               <w:jc w:val="center"/>
             </w:pPr>
             <w:r>
@@ -1060,6 +1160,9 @@
             <w:vAlign w:val="center"/>
           </w:tcPr>
           <w:p>
+            <w:pPr>
+              <w:keepNext w:val="0"/>
+            </w:pPr>
             <w:r>
               <w:rPr>
                 <w:b w:val="0"/>
@@ -1076,6 +1179,7 @@
           </w:tcPr>
           <w:p>
             <w:pPr>
+              <w:keepNext w:val="0"/>
               <w:jc w:val="center"/>
             </w:pPr>
             <w:r>
@@ -1093,6 +1197,9 @@
             <w:vAlign w:val="center"/>
           </w:tcPr>
           <w:p>
+            <w:pPr>
+              <w:keepNext w:val="0"/>
+            </w:pPr>
             <w:r>
               <w:rPr>
                 <w:b w:val="0"/>
@@ -1108,6 +1215,9 @@
             <w:vAlign w:val="center"/>
           </w:tcPr>
           <w:p>
+            <w:pPr>
+              <w:keepNext w:val="0"/>
+            </w:pPr>
             <w:r>
               <w:rPr>
                 <w:b w:val="0"/>
@@ -1165,6 +1275,7 @@
           </w:tcPr>
           <w:p>
             <w:pPr>
+              <w:keepNext/>
               <w:jc w:val="center"/>
             </w:pPr>
             <w:r>
@@ -1183,6 +1294,9 @@
             <w:shd w:val="clear" w:color="auto" w:fill="E6E6E6"/>
           </w:tcPr>
           <w:p>
+            <w:pPr>
+              <w:keepNext/>
+            </w:pPr>
             <w:r>
               <w:rPr>
                 <w:b/>
@@ -1200,6 +1314,7 @@
           </w:tcPr>
           <w:p>
             <w:pPr>
+              <w:keepNext/>
               <w:jc w:val="center"/>
             </w:pPr>
             <w:r>
@@ -1218,6 +1333,9 @@
             <w:shd w:val="clear" w:color="auto" w:fill="E6E6E6"/>
           </w:tcPr>
           <w:p>
+            <w:pPr>
+              <w:keepNext/>
+            </w:pPr>
             <w:r>
               <w:rPr>
                 <w:b/>
@@ -1234,6 +1352,9 @@
             <w:shd w:val="clear" w:color="auto" w:fill="E6E6E6"/>
           </w:tcPr>
           <w:p>
+            <w:pPr>
+              <w:keepNext/>
+            </w:pPr>
             <w:r>
               <w:rPr>
                 <w:b/>
@@ -1255,6 +1376,7 @@
           </w:tcPr>
           <w:p>
             <w:pPr>
+              <w:keepNext w:val="0"/>
               <w:jc w:val="center"/>
             </w:pPr>
             <w:r>
@@ -1272,6 +1394,9 @@
             <w:vAlign w:val="center"/>
           </w:tcPr>
           <w:p>
+            <w:pPr>
+              <w:keepNext w:val="0"/>
+            </w:pPr>
             <w:r>
               <w:rPr>
                 <w:b w:val="0"/>
@@ -1288,6 +1413,7 @@
           </w:tcPr>
           <w:p>
             <w:pPr>
+              <w:keepNext w:val="0"/>
               <w:jc w:val="center"/>
             </w:pPr>
             <w:r>
@@ -1305,6 +1431,9 @@
             <w:vAlign w:val="center"/>
           </w:tcPr>
           <w:p>
+            <w:pPr>
+              <w:keepNext w:val="0"/>
+            </w:pPr>
             <w:r>
               <w:rPr>
                 <w:b w:val="0"/>
@@ -1320,6 +1449,9 @@
             <w:vAlign w:val="center"/>
           </w:tcPr>
           <w:p>
+            <w:pPr>
+              <w:keepNext w:val="0"/>
+            </w:pPr>
             <w:r>
               <w:rPr>
                 <w:b w:val="0"/>
@@ -1341,6 +1473,7 @@
           </w:tcPr>
           <w:p>
             <w:pPr>
+              <w:keepNext w:val="0"/>
               <w:jc w:val="center"/>
             </w:pPr>
             <w:r>
@@ -1358,6 +1491,9 @@
             <w:vAlign w:val="center"/>
           </w:tcPr>
           <w:p>
+            <w:pPr>
+              <w:keepNext w:val="0"/>
+            </w:pPr>
             <w:r>
               <w:rPr>
                 <w:b w:val="0"/>
@@ -1374,6 +1510,7 @@
           </w:tcPr>
           <w:p>
             <w:pPr>
+              <w:keepNext w:val="0"/>
               <w:jc w:val="center"/>
             </w:pPr>
             <w:r>
@@ -1391,6 +1528,9 @@
             <w:vAlign w:val="center"/>
           </w:tcPr>
           <w:p>
+            <w:pPr>
+              <w:keepNext w:val="0"/>
+            </w:pPr>
             <w:r>
               <w:rPr>
                 <w:b w:val="0"/>
@@ -1406,6 +1546,9 @@
             <w:vAlign w:val="center"/>
           </w:tcPr>
           <w:p>
+            <w:pPr>
+              <w:keepNext w:val="0"/>
+            </w:pPr>
             <w:r>
               <w:rPr>
                 <w:b w:val="0"/>
@@ -1427,6 +1570,7 @@
           </w:tcPr>
           <w:p>
             <w:pPr>
+              <w:keepNext w:val="0"/>
               <w:jc w:val="center"/>
             </w:pPr>
             <w:r>
@@ -1444,6 +1588,9 @@
             <w:vAlign w:val="center"/>
           </w:tcPr>
           <w:p>
+            <w:pPr>
+              <w:keepNext w:val="0"/>
+            </w:pPr>
             <w:r>
               <w:rPr>
                 <w:b w:val="0"/>
@@ -1460,6 +1607,7 @@
           </w:tcPr>
           <w:p>
             <w:pPr>
+              <w:keepNext w:val="0"/>
               <w:jc w:val="center"/>
             </w:pPr>
             <w:r>
@@ -1477,6 +1625,9 @@
             <w:vAlign w:val="center"/>
           </w:tcPr>
           <w:p>
+            <w:pPr>
+              <w:keepNext w:val="0"/>
+            </w:pPr>
             <w:r>
               <w:rPr>
                 <w:b w:val="0"/>
@@ -1492,6 +1643,9 @@
             <w:vAlign w:val="center"/>
           </w:tcPr>
           <w:p>
+            <w:pPr>
+              <w:keepNext w:val="0"/>
+            </w:pPr>
             <w:r>
               <w:rPr>
                 <w:b w:val="0"/>
@@ -1513,6 +1667,7 @@
           </w:tcPr>
           <w:p>
             <w:pPr>
+              <w:keepNext w:val="0"/>
               <w:jc w:val="center"/>
             </w:pPr>
             <w:r>
@@ -1530,6 +1685,9 @@
             <w:vAlign w:val="center"/>
           </w:tcPr>
           <w:p>
+            <w:pPr>
+              <w:keepNext w:val="0"/>
+            </w:pPr>
             <w:r>
               <w:rPr>
                 <w:b w:val="0"/>
@@ -1546,6 +1704,7 @@
           </w:tcPr>
           <w:p>
             <w:pPr>
+              <w:keepNext w:val="0"/>
               <w:jc w:val="center"/>
             </w:pPr>
             <w:r>
@@ -1563,6 +1722,9 @@
             <w:vAlign w:val="center"/>
           </w:tcPr>
           <w:p>
+            <w:pPr>
+              <w:keepNext w:val="0"/>
+            </w:pPr>
             <w:r>
               <w:rPr>
                 <w:b w:val="0"/>
@@ -1578,6 +1740,9 @@
             <w:vAlign w:val="center"/>
           </w:tcPr>
           <w:p>
+            <w:pPr>
+              <w:keepNext w:val="0"/>
+            </w:pPr>
             <w:r>
               <w:rPr>
                 <w:b w:val="0"/>
@@ -1599,6 +1764,7 @@
           </w:tcPr>
           <w:p>
             <w:pPr>
+              <w:keepNext w:val="0"/>
               <w:jc w:val="center"/>
             </w:pPr>
             <w:r>
@@ -1616,6 +1782,9 @@
             <w:vAlign w:val="center"/>
           </w:tcPr>
           <w:p>
+            <w:pPr>
+              <w:keepNext w:val="0"/>
+            </w:pPr>
             <w:r>
               <w:rPr>
                 <w:b w:val="0"/>
@@ -1632,6 +1801,7 @@
           </w:tcPr>
           <w:p>
             <w:pPr>
+              <w:keepNext w:val="0"/>
               <w:jc w:val="center"/>
             </w:pPr>
             <w:r>
@@ -1649,6 +1819,9 @@
             <w:vAlign w:val="center"/>
           </w:tcPr>
           <w:p>
+            <w:pPr>
+              <w:keepNext w:val="0"/>
+            </w:pPr>
             <w:r>
               <w:rPr>
                 <w:b w:val="0"/>
@@ -1664,6 +1837,9 @@
             <w:vAlign w:val="center"/>
           </w:tcPr>
           <w:p>
+            <w:pPr>
+              <w:keepNext w:val="0"/>
+            </w:pPr>
             <w:r>
               <w:rPr>
                 <w:b w:val="0"/>
@@ -1685,6 +1861,7 @@
           </w:tcPr>
           <w:p>
             <w:pPr>
+              <w:keepNext w:val="0"/>
               <w:jc w:val="center"/>
             </w:pPr>
             <w:r>
@@ -1702,6 +1879,9 @@
             <w:vAlign w:val="center"/>
           </w:tcPr>
           <w:p>
+            <w:pPr>
+              <w:keepNext w:val="0"/>
+            </w:pPr>
             <w:r>
               <w:rPr>
                 <w:b w:val="0"/>
@@ -1718,6 +1898,7 @@
           </w:tcPr>
           <w:p>
             <w:pPr>
+              <w:keepNext w:val="0"/>
               <w:jc w:val="center"/>
             </w:pPr>
             <w:r>
@@ -1735,6 +1916,9 @@
             <w:vAlign w:val="center"/>
           </w:tcPr>
           <w:p>
+            <w:pPr>
+              <w:keepNext w:val="0"/>
+            </w:pPr>
             <w:r>
               <w:rPr>
                 <w:b w:val="0"/>
@@ -1750,6 +1934,9 @@
             <w:vAlign w:val="center"/>
           </w:tcPr>
           <w:p>
+            <w:pPr>
+              <w:keepNext w:val="0"/>
+            </w:pPr>
             <w:r>
               <w:rPr>
                 <w:b w:val="0"/>
@@ -1771,6 +1958,7 @@
           </w:tcPr>
           <w:p>
             <w:pPr>
+              <w:keepNext w:val="0"/>
               <w:jc w:val="center"/>
             </w:pPr>
             <w:r>
@@ -1788,6 +1976,9 @@
             <w:vAlign w:val="center"/>
           </w:tcPr>
           <w:p>
+            <w:pPr>
+              <w:keepNext w:val="0"/>
+            </w:pPr>
             <w:r>
               <w:rPr>
                 <w:b w:val="0"/>
@@ -1804,6 +1995,7 @@
           </w:tcPr>
           <w:p>
             <w:pPr>
+              <w:keepNext w:val="0"/>
               <w:jc w:val="center"/>
             </w:pPr>
             <w:r>
@@ -1821,6 +2013,9 @@
             <w:vAlign w:val="center"/>
           </w:tcPr>
           <w:p>
+            <w:pPr>
+              <w:keepNext w:val="0"/>
+            </w:pPr>
             <w:r>
               <w:rPr>
                 <w:b w:val="0"/>
@@ -1836,6 +2031,9 @@
             <w:vAlign w:val="center"/>
           </w:tcPr>
           <w:p>
+            <w:pPr>
+              <w:keepNext w:val="0"/>
+            </w:pPr>
             <w:r>
               <w:rPr>
                 <w:b w:val="0"/>
@@ -1857,6 +2055,7 @@
           </w:tcPr>
           <w:p>
             <w:pPr>
+              <w:keepNext w:val="0"/>
               <w:jc w:val="center"/>
             </w:pPr>
             <w:r>
@@ -1874,6 +2073,9 @@
             <w:vAlign w:val="center"/>
           </w:tcPr>
           <w:p>
+            <w:pPr>
+              <w:keepNext w:val="0"/>
+            </w:pPr>
             <w:r>
               <w:rPr>
                 <w:b w:val="0"/>
@@ -1890,6 +2092,7 @@
           </w:tcPr>
           <w:p>
             <w:pPr>
+              <w:keepNext w:val="0"/>
               <w:jc w:val="center"/>
             </w:pPr>
             <w:r>
@@ -1907,6 +2110,9 @@
             <w:vAlign w:val="center"/>
           </w:tcPr>
           <w:p>
+            <w:pPr>
+              <w:keepNext w:val="0"/>
+            </w:pPr>
             <w:r>
               <w:rPr>
                 <w:b w:val="0"/>
@@ -1922,6 +2128,9 @@
             <w:vAlign w:val="center"/>
           </w:tcPr>
           <w:p>
+            <w:pPr>
+              <w:keepNext w:val="0"/>
+            </w:pPr>
             <w:r>
               <w:rPr>
                 <w:b w:val="0"/>
@@ -1943,6 +2152,7 @@
           </w:tcPr>
           <w:p>
             <w:pPr>
+              <w:keepNext w:val="0"/>
               <w:jc w:val="center"/>
             </w:pPr>
             <w:r>
@@ -1960,6 +2170,9 @@
             <w:vAlign w:val="center"/>
           </w:tcPr>
           <w:p>
+            <w:pPr>
+              <w:keepNext w:val="0"/>
+            </w:pPr>
             <w:r>
               <w:rPr>
                 <w:b w:val="0"/>
@@ -1976,6 +2189,7 @@
           </w:tcPr>
           <w:p>
             <w:pPr>
+              <w:keepNext w:val="0"/>
               <w:jc w:val="center"/>
             </w:pPr>
             <w:r>
@@ -1993,6 +2207,9 @@
             <w:vAlign w:val="center"/>
           </w:tcPr>
           <w:p>
+            <w:pPr>
+              <w:keepNext w:val="0"/>
+            </w:pPr>
             <w:r>
               <w:rPr>
                 <w:b w:val="0"/>
@@ -2008,6 +2225,9 @@
             <w:vAlign w:val="center"/>
           </w:tcPr>
           <w:p>
+            <w:pPr>
+              <w:keepNext w:val="0"/>
+            </w:pPr>
             <w:r>
               <w:rPr>
                 <w:b w:val="0"/>
@@ -2029,6 +2249,7 @@
           </w:tcPr>
           <w:p>
             <w:pPr>
+              <w:keepNext w:val="0"/>
               <w:jc w:val="center"/>
             </w:pPr>
             <w:r>
@@ -2046,6 +2267,9 @@
             <w:vAlign w:val="center"/>
           </w:tcPr>
           <w:p>
+            <w:pPr>
+              <w:keepNext w:val="0"/>
+            </w:pPr>
             <w:r>
               <w:rPr>
                 <w:b w:val="0"/>
@@ -2062,6 +2286,7 @@
           </w:tcPr>
           <w:p>
             <w:pPr>
+              <w:keepNext w:val="0"/>
               <w:jc w:val="center"/>
             </w:pPr>
             <w:r>
@@ -2079,6 +2304,9 @@
             <w:vAlign w:val="center"/>
           </w:tcPr>
           <w:p>
+            <w:pPr>
+              <w:keepNext w:val="0"/>
+            </w:pPr>
             <w:r>
               <w:rPr>
                 <w:b w:val="0"/>
@@ -2094,6 +2322,9 @@
             <w:vAlign w:val="center"/>
           </w:tcPr>
           <w:p>
+            <w:pPr>
+              <w:keepNext w:val="0"/>
+            </w:pPr>
             <w:r>
               <w:rPr>
                 <w:b w:val="0"/>
@@ -2151,6 +2382,7 @@
           </w:tcPr>
           <w:p>
             <w:pPr>
+              <w:keepNext/>
               <w:jc w:val="center"/>
             </w:pPr>
             <w:r>
@@ -2169,6 +2401,9 @@
             <w:shd w:val="clear" w:color="auto" w:fill="E6E6E6"/>
           </w:tcPr>
           <w:p>
+            <w:pPr>
+              <w:keepNext/>
+            </w:pPr>
             <w:r>
               <w:rPr>
                 <w:b/>
@@ -2186,6 +2421,7 @@
           </w:tcPr>
           <w:p>
             <w:pPr>
+              <w:keepNext/>
               <w:jc w:val="center"/>
             </w:pPr>
             <w:r>
@@ -2204,6 +2440,9 @@
             <w:shd w:val="clear" w:color="auto" w:fill="E6E6E6"/>
           </w:tcPr>
           <w:p>
+            <w:pPr>
+              <w:keepNext/>
+            </w:pPr>
             <w:r>
               <w:rPr>
                 <w:b/>
@@ -2220,6 +2459,9 @@
             <w:shd w:val="clear" w:color="auto" w:fill="E6E6E6"/>
           </w:tcPr>
           <w:p>
+            <w:pPr>
+              <w:keepNext/>
+            </w:pPr>
             <w:r>
               <w:rPr>
                 <w:b/>
@@ -2241,6 +2483,7 @@
           </w:tcPr>
           <w:p>
             <w:pPr>
+              <w:keepNext w:val="0"/>
               <w:jc w:val="center"/>
             </w:pPr>
             <w:r>
@@ -2258,6 +2501,9 @@
             <w:vAlign w:val="center"/>
           </w:tcPr>
           <w:p>
+            <w:pPr>
+              <w:keepNext w:val="0"/>
+            </w:pPr>
             <w:r>
               <w:rPr>
                 <w:b w:val="0"/>
@@ -2274,6 +2520,7 @@
           </w:tcPr>
           <w:p>
             <w:pPr>
+              <w:keepNext w:val="0"/>
               <w:jc w:val="center"/>
             </w:pPr>
             <w:r>
@@ -2291,6 +2538,9 @@
             <w:vAlign w:val="center"/>
           </w:tcPr>
           <w:p>
+            <w:pPr>
+              <w:keepNext w:val="0"/>
+            </w:pPr>
             <w:r>
               <w:rPr>
                 <w:b w:val="0"/>
@@ -2306,6 +2556,9 @@
             <w:vAlign w:val="center"/>
           </w:tcPr>
           <w:p>
+            <w:pPr>
+              <w:keepNext w:val="0"/>
+            </w:pPr>
             <w:r>
               <w:rPr>
                 <w:b w:val="0"/>
@@ -2327,6 +2580,7 @@
           </w:tcPr>
           <w:p>
             <w:pPr>
+              <w:keepNext w:val="0"/>
               <w:jc w:val="center"/>
             </w:pPr>
             <w:r>
@@ -2344,6 +2598,9 @@
             <w:vAlign w:val="center"/>
           </w:tcPr>
           <w:p>
+            <w:pPr>
+              <w:keepNext w:val="0"/>
+            </w:pPr>
             <w:r>
               <w:rPr>
                 <w:b w:val="0"/>
@@ -2360,6 +2617,7 @@
           </w:tcPr>
           <w:p>
             <w:pPr>
+              <w:keepNext w:val="0"/>
               <w:jc w:val="center"/>
             </w:pPr>
             <w:r>
@@ -2377,6 +2635,9 @@
             <w:vAlign w:val="center"/>
           </w:tcPr>
           <w:p>
+            <w:pPr>
+              <w:keepNext w:val="0"/>
+            </w:pPr>
             <w:r>
               <w:rPr>
                 <w:b w:val="0"/>
@@ -2392,6 +2653,9 @@
             <w:vAlign w:val="center"/>
           </w:tcPr>
           <w:p>
+            <w:pPr>
+              <w:keepNext w:val="0"/>
+            </w:pPr>
             <w:r>
               <w:rPr>
                 <w:b w:val="0"/>
@@ -2413,6 +2677,7 @@
           </w:tcPr>
           <w:p>
             <w:pPr>
+              <w:keepNext w:val="0"/>
               <w:jc w:val="center"/>
             </w:pPr>
             <w:r>
@@ -2430,6 +2695,9 @@
             <w:vAlign w:val="center"/>
           </w:tcPr>
           <w:p>
+            <w:pPr>
+              <w:keepNext w:val="0"/>
+            </w:pPr>
             <w:r>
               <w:rPr>
                 <w:b w:val="0"/>
@@ -2446,6 +2714,7 @@
           </w:tcPr>
           <w:p>
             <w:pPr>
+              <w:keepNext w:val="0"/>
               <w:jc w:val="center"/>
             </w:pPr>
             <w:r>
@@ -2463,6 +2732,9 @@
             <w:vAlign w:val="center"/>
           </w:tcPr>
           <w:p>
+            <w:pPr>
+              <w:keepNext w:val="0"/>
+            </w:pPr>
             <w:r>
               <w:rPr>
                 <w:b w:val="0"/>
@@ -2478,6 +2750,9 @@
             <w:vAlign w:val="center"/>
           </w:tcPr>
           <w:p>
+            <w:pPr>
+              <w:keepNext w:val="0"/>
+            </w:pPr>
             <w:r>
               <w:rPr>
                 <w:b w:val="0"/>
@@ -2499,6 +2774,7 @@
           </w:tcPr>
           <w:p>
             <w:pPr>
+              <w:keepNext w:val="0"/>
               <w:jc w:val="center"/>
             </w:pPr>
             <w:r>
@@ -2516,6 +2792,9 @@
             <w:vAlign w:val="center"/>
           </w:tcPr>
           <w:p>
+            <w:pPr>
+              <w:keepNext w:val="0"/>
+            </w:pPr>
             <w:r>
               <w:rPr>
                 <w:b w:val="0"/>
@@ -2532,6 +2811,7 @@
           </w:tcPr>
           <w:p>
             <w:pPr>
+              <w:keepNext w:val="0"/>
               <w:jc w:val="center"/>
             </w:pPr>
             <w:r>
@@ -2549,6 +2829,9 @@
             <w:vAlign w:val="center"/>
           </w:tcPr>
           <w:p>
+            <w:pPr>
+              <w:keepNext w:val="0"/>
+            </w:pPr>
             <w:r>
               <w:rPr>
                 <w:b w:val="0"/>
@@ -2564,6 +2847,9 @@
             <w:vAlign w:val="center"/>
           </w:tcPr>
           <w:p>
+            <w:pPr>
+              <w:keepNext w:val="0"/>
+            </w:pPr>
             <w:r>
               <w:rPr>
                 <w:b w:val="0"/>
@@ -2585,6 +2871,7 @@
           </w:tcPr>
           <w:p>
             <w:pPr>
+              <w:keepNext w:val="0"/>
               <w:jc w:val="center"/>
             </w:pPr>
             <w:r>
@@ -2602,6 +2889,9 @@
             <w:vAlign w:val="center"/>
           </w:tcPr>
           <w:p>
+            <w:pPr>
+              <w:keepNext w:val="0"/>
+            </w:pPr>
             <w:r>
               <w:rPr>
                 <w:b w:val="0"/>
@@ -2618,6 +2908,7 @@
           </w:tcPr>
           <w:p>
             <w:pPr>
+              <w:keepNext w:val="0"/>
               <w:jc w:val="center"/>
             </w:pPr>
             <w:r>
@@ -2635,6 +2926,9 @@
             <w:vAlign w:val="center"/>
           </w:tcPr>
           <w:p>
+            <w:pPr>
+              <w:keepNext w:val="0"/>
+            </w:pPr>
             <w:r>
               <w:rPr>
                 <w:b w:val="0"/>
@@ -2650,6 +2944,9 @@
             <w:vAlign w:val="center"/>
           </w:tcPr>
           <w:p>
+            <w:pPr>
+              <w:keepNext w:val="0"/>
+            </w:pPr>
             <w:r>
               <w:rPr>
                 <w:b w:val="0"/>
@@ -2671,6 +2968,7 @@
           </w:tcPr>
           <w:p>
             <w:pPr>
+              <w:keepNext w:val="0"/>
               <w:jc w:val="center"/>
             </w:pPr>
             <w:r>
@@ -2688,6 +2986,9 @@
             <w:vAlign w:val="center"/>
           </w:tcPr>
           <w:p>
+            <w:pPr>
+              <w:keepNext w:val="0"/>
+            </w:pPr>
             <w:r>
               <w:rPr>
                 <w:b w:val="0"/>
@@ -2704,6 +3005,7 @@
           </w:tcPr>
           <w:p>
             <w:pPr>
+              <w:keepNext w:val="0"/>
               <w:jc w:val="center"/>
             </w:pPr>
             <w:r>
@@ -2721,6 +3023,9 @@
             <w:vAlign w:val="center"/>
           </w:tcPr>
           <w:p>
+            <w:pPr>
+              <w:keepNext w:val="0"/>
+            </w:pPr>
             <w:r>
               <w:rPr>
                 <w:b w:val="0"/>
@@ -2736,6 +3041,9 @@
             <w:vAlign w:val="center"/>
           </w:tcPr>
           <w:p>
+            <w:pPr>
+              <w:keepNext w:val="0"/>
+            </w:pPr>
             <w:r>
               <w:rPr>
                 <w:b w:val="0"/>
@@ -2757,6 +3065,7 @@
           </w:tcPr>
           <w:p>
             <w:pPr>
+              <w:keepNext w:val="0"/>
               <w:jc w:val="center"/>
             </w:pPr>
             <w:r>
@@ -2774,6 +3083,9 @@
             <w:vAlign w:val="center"/>
           </w:tcPr>
           <w:p>
+            <w:pPr>
+              <w:keepNext w:val="0"/>
+            </w:pPr>
             <w:r>
               <w:rPr>
                 <w:b w:val="0"/>
@@ -2790,6 +3102,7 @@
           </w:tcPr>
           <w:p>
             <w:pPr>
+              <w:keepNext w:val="0"/>
               <w:jc w:val="center"/>
             </w:pPr>
             <w:r>
@@ -2807,6 +3120,9 @@
             <w:vAlign w:val="center"/>
           </w:tcPr>
           <w:p>
+            <w:pPr>
+              <w:keepNext w:val="0"/>
+            </w:pPr>
             <w:r>
               <w:rPr>
                 <w:b w:val="0"/>
@@ -2822,6 +3138,9 @@
             <w:vAlign w:val="center"/>
           </w:tcPr>
           <w:p>
+            <w:pPr>
+              <w:keepNext w:val="0"/>
+            </w:pPr>
             <w:r>
               <w:rPr>
                 <w:b w:val="0"/>
@@ -2843,6 +3162,7 @@
           </w:tcPr>
           <w:p>
             <w:pPr>
+              <w:keepNext w:val="0"/>
               <w:jc w:val="center"/>
             </w:pPr>
             <w:r>
@@ -2860,6 +3180,9 @@
             <w:vAlign w:val="center"/>
           </w:tcPr>
           <w:p>
+            <w:pPr>
+              <w:keepNext w:val="0"/>
+            </w:pPr>
             <w:r>
               <w:rPr>
                 <w:b w:val="0"/>
@@ -2876,6 +3199,7 @@
           </w:tcPr>
           <w:p>
             <w:pPr>
+              <w:keepNext w:val="0"/>
               <w:jc w:val="center"/>
             </w:pPr>
             <w:r>
@@ -2893,6 +3217,9 @@
             <w:vAlign w:val="center"/>
           </w:tcPr>
           <w:p>
+            <w:pPr>
+              <w:keepNext w:val="0"/>
+            </w:pPr>
             <w:r>
               <w:rPr>
                 <w:b w:val="0"/>
@@ -2908,6 +3235,9 @@
             <w:vAlign w:val="center"/>
           </w:tcPr>
           <w:p>
+            <w:pPr>
+              <w:keepNext w:val="0"/>
+            </w:pPr>
             <w:r>
               <w:rPr>
                 <w:b w:val="0"/>
@@ -2929,6 +3259,7 @@
           </w:tcPr>
           <w:p>
             <w:pPr>
+              <w:keepNext w:val="0"/>
               <w:jc w:val="center"/>
             </w:pPr>
             <w:r>
@@ -2946,6 +3277,9 @@
             <w:vAlign w:val="center"/>
           </w:tcPr>
           <w:p>
+            <w:pPr>
+              <w:keepNext w:val="0"/>
+            </w:pPr>
             <w:r>
               <w:rPr>
                 <w:b w:val="0"/>
@@ -2962,6 +3296,7 @@
           </w:tcPr>
           <w:p>
             <w:pPr>
+              <w:keepNext w:val="0"/>
               <w:jc w:val="center"/>
             </w:pPr>
             <w:r>
@@ -2979,6 +3314,9 @@
             <w:vAlign w:val="center"/>
           </w:tcPr>
           <w:p>
+            <w:pPr>
+              <w:keepNext w:val="0"/>
+            </w:pPr>
             <w:r>
               <w:rPr>
                 <w:b w:val="0"/>
@@ -2994,6 +3332,9 @@
             <w:vAlign w:val="center"/>
           </w:tcPr>
           <w:p>
+            <w:pPr>
+              <w:keepNext w:val="0"/>
+            </w:pPr>
             <w:r>
               <w:rPr>
                 <w:b w:val="0"/>
@@ -3015,6 +3356,7 @@
           </w:tcPr>
           <w:p>
             <w:pPr>
+              <w:keepNext w:val="0"/>
               <w:jc w:val="center"/>
             </w:pPr>
             <w:r>
@@ -3032,6 +3374,9 @@
             <w:vAlign w:val="center"/>
           </w:tcPr>
           <w:p>
+            <w:pPr>
+              <w:keepNext w:val="0"/>
+            </w:pPr>
             <w:r>
               <w:rPr>
                 <w:b w:val="0"/>
@@ -3048,6 +3393,7 @@
           </w:tcPr>
           <w:p>
             <w:pPr>
+              <w:keepNext w:val="0"/>
               <w:jc w:val="center"/>
             </w:pPr>
             <w:r>
@@ -3065,6 +3411,9 @@
             <w:vAlign w:val="center"/>
           </w:tcPr>
           <w:p>
+            <w:pPr>
+              <w:keepNext w:val="0"/>
+            </w:pPr>
             <w:r>
               <w:rPr>
                 <w:b w:val="0"/>
@@ -3080,6 +3429,9 @@
             <w:vAlign w:val="center"/>
           </w:tcPr>
           <w:p>
+            <w:pPr>
+              <w:keepNext w:val="0"/>
+            </w:pPr>
             <w:r>
               <w:rPr>
                 <w:b w:val="0"/>
@@ -3137,6 +3489,7 @@
           </w:tcPr>
           <w:p>
             <w:pPr>
+              <w:keepNext/>
               <w:jc w:val="center"/>
             </w:pPr>
             <w:r>
@@ -3155,6 +3508,9 @@
             <w:shd w:val="clear" w:color="auto" w:fill="E6E6E6"/>
           </w:tcPr>
           <w:p>
+            <w:pPr>
+              <w:keepNext/>
+            </w:pPr>
             <w:r>
               <w:rPr>
                 <w:b/>
@@ -3172,6 +3528,7 @@
           </w:tcPr>
           <w:p>
             <w:pPr>
+              <w:keepNext/>
               <w:jc w:val="center"/>
             </w:pPr>
             <w:r>
@@ -3190,6 +3547,9 @@
             <w:shd w:val="clear" w:color="auto" w:fill="E6E6E6"/>
           </w:tcPr>
           <w:p>
+            <w:pPr>
+              <w:keepNext/>
+            </w:pPr>
             <w:r>
               <w:rPr>
                 <w:b/>
@@ -3206,6 +3566,9 @@
             <w:shd w:val="clear" w:color="auto" w:fill="E6E6E6"/>
           </w:tcPr>
           <w:p>
+            <w:pPr>
+              <w:keepNext/>
+            </w:pPr>
             <w:r>
               <w:rPr>
                 <w:b/>
@@ -3227,6 +3590,7 @@
           </w:tcPr>
           <w:p>
             <w:pPr>
+              <w:keepNext w:val="0"/>
               <w:jc w:val="center"/>
             </w:pPr>
             <w:r>
@@ -3244,6 +3608,9 @@
             <w:vAlign w:val="center"/>
           </w:tcPr>
           <w:p>
+            <w:pPr>
+              <w:keepNext w:val="0"/>
+            </w:pPr>
             <w:r>
               <w:rPr>
                 <w:b w:val="0"/>
@@ -3260,6 +3627,7 @@
           </w:tcPr>
           <w:p>
             <w:pPr>
+              <w:keepNext w:val="0"/>
               <w:jc w:val="center"/>
             </w:pPr>
             <w:r>
@@ -3277,6 +3645,9 @@
             <w:vAlign w:val="center"/>
           </w:tcPr>
           <w:p>
+            <w:pPr>
+              <w:keepNext w:val="0"/>
+            </w:pPr>
             <w:r>
               <w:rPr>
                 <w:b w:val="0"/>
@@ -3292,6 +3663,9 @@
             <w:vAlign w:val="center"/>
           </w:tcPr>
           <w:p>
+            <w:pPr>
+              <w:keepNext w:val="0"/>
+            </w:pPr>
             <w:r>
               <w:rPr>
                 <w:b w:val="0"/>
@@ -3313,6 +3687,7 @@
           </w:tcPr>
           <w:p>
             <w:pPr>
+              <w:keepNext w:val="0"/>
               <w:jc w:val="center"/>
             </w:pPr>
             <w:r>
@@ -3330,6 +3705,9 @@
             <w:vAlign w:val="center"/>
           </w:tcPr>
           <w:p>
+            <w:pPr>
+              <w:keepNext w:val="0"/>
+            </w:pPr>
             <w:r>
               <w:rPr>
                 <w:b w:val="0"/>
@@ -3346,6 +3724,7 @@
           </w:tcPr>
           <w:p>
             <w:pPr>
+              <w:keepNext w:val="0"/>
               <w:jc w:val="center"/>
             </w:pPr>
             <w:r>
@@ -3363,6 +3742,9 @@
             <w:vAlign w:val="center"/>
           </w:tcPr>
           <w:p>
+            <w:pPr>
+              <w:keepNext w:val="0"/>
+            </w:pPr>
             <w:r>
               <w:rPr>
                 <w:b w:val="0"/>
@@ -3378,6 +3760,9 @@
             <w:vAlign w:val="center"/>
           </w:tcPr>
           <w:p>
+            <w:pPr>
+              <w:keepNext w:val="0"/>
+            </w:pPr>
             <w:r>
               <w:rPr>
                 <w:b w:val="0"/>
@@ -3399,6 +3784,7 @@
           </w:tcPr>
           <w:p>
             <w:pPr>
+              <w:keepNext w:val="0"/>
               <w:jc w:val="center"/>
             </w:pPr>
             <w:r>
@@ -3416,6 +3802,9 @@
             <w:vAlign w:val="center"/>
           </w:tcPr>
           <w:p>
+            <w:pPr>
+              <w:keepNext w:val="0"/>
+            </w:pPr>
             <w:r>
               <w:rPr>
                 <w:b w:val="0"/>
@@ -3432,6 +3821,7 @@
           </w:tcPr>
           <w:p>
             <w:pPr>
+              <w:keepNext w:val="0"/>
               <w:jc w:val="center"/>
             </w:pPr>
             <w:r>
@@ -3449,6 +3839,9 @@
             <w:vAlign w:val="center"/>
           </w:tcPr>
           <w:p>
+            <w:pPr>
+              <w:keepNext w:val="0"/>
+            </w:pPr>
             <w:r>
               <w:rPr>
                 <w:b w:val="0"/>
@@ -3464,6 +3857,9 @@
             <w:vAlign w:val="center"/>
           </w:tcPr>
           <w:p>
+            <w:pPr>
+              <w:keepNext w:val="0"/>
+            </w:pPr>
             <w:r>
               <w:rPr>
                 <w:b w:val="0"/>
@@ -3485,6 +3881,7 @@
           </w:tcPr>
           <w:p>
             <w:pPr>
+              <w:keepNext w:val="0"/>
               <w:jc w:val="center"/>
             </w:pPr>
             <w:r>
@@ -3502,6 +3899,9 @@
             <w:vAlign w:val="center"/>
           </w:tcPr>
           <w:p>
+            <w:pPr>
+              <w:keepNext w:val="0"/>
+            </w:pPr>
             <w:r>
               <w:rPr>
                 <w:b w:val="0"/>
@@ -3518,6 +3918,7 @@
           </w:tcPr>
           <w:p>
             <w:pPr>
+              <w:keepNext w:val="0"/>
               <w:jc w:val="center"/>
             </w:pPr>
             <w:r>
@@ -3535,6 +3936,9 @@
             <w:vAlign w:val="center"/>
           </w:tcPr>
           <w:p>
+            <w:pPr>
+              <w:keepNext w:val="0"/>
+            </w:pPr>
             <w:r>
               <w:rPr>
                 <w:b w:val="0"/>
@@ -3550,6 +3954,9 @@
             <w:vAlign w:val="center"/>
           </w:tcPr>
           <w:p>
+            <w:pPr>
+              <w:keepNext w:val="0"/>
+            </w:pPr>
             <w:r>
               <w:rPr>
                 <w:b w:val="0"/>
@@ -3571,6 +3978,7 @@
           </w:tcPr>
           <w:p>
             <w:pPr>
+              <w:keepNext w:val="0"/>
               <w:jc w:val="center"/>
             </w:pPr>
             <w:r>
@@ -3588,6 +3996,9 @@
             <w:vAlign w:val="center"/>
           </w:tcPr>
           <w:p>
+            <w:pPr>
+              <w:keepNext w:val="0"/>
+            </w:pPr>
             <w:r>
               <w:rPr>
                 <w:b w:val="0"/>
@@ -3604,6 +4015,7 @@
           </w:tcPr>
           <w:p>
             <w:pPr>
+              <w:keepNext w:val="0"/>
               <w:jc w:val="center"/>
             </w:pPr>
             <w:r>
@@ -3621,6 +4033,9 @@
             <w:vAlign w:val="center"/>
           </w:tcPr>
           <w:p>
+            <w:pPr>
+              <w:keepNext w:val="0"/>
+            </w:pPr>
             <w:r>
               <w:rPr>
                 <w:b w:val="0"/>
@@ -3636,6 +4051,9 @@
             <w:vAlign w:val="center"/>
           </w:tcPr>
           <w:p>
+            <w:pPr>
+              <w:keepNext w:val="0"/>
+            </w:pPr>
             <w:r>
               <w:rPr>
                 <w:b w:val="0"/>
@@ -3657,6 +4075,7 @@
           </w:tcPr>
           <w:p>
             <w:pPr>
+              <w:keepNext w:val="0"/>
               <w:jc w:val="center"/>
             </w:pPr>
             <w:r>
@@ -3674,6 +4093,9 @@
             <w:vAlign w:val="center"/>
           </w:tcPr>
           <w:p>
+            <w:pPr>
+              <w:keepNext w:val="0"/>
+            </w:pPr>
             <w:r>
               <w:rPr>
                 <w:b w:val="0"/>
@@ -3690,6 +4112,7 @@
           </w:tcPr>
           <w:p>
             <w:pPr>
+              <w:keepNext w:val="0"/>
               <w:jc w:val="center"/>
             </w:pPr>
             <w:r>
@@ -3707,6 +4130,9 @@
             <w:vAlign w:val="center"/>
           </w:tcPr>
           <w:p>
+            <w:pPr>
+              <w:keepNext w:val="0"/>
+            </w:pPr>
             <w:r>
               <w:rPr>
                 <w:b w:val="0"/>
@@ -3722,6 +4148,9 @@
             <w:vAlign w:val="center"/>
           </w:tcPr>
           <w:p>
+            <w:pPr>
+              <w:keepNext w:val="0"/>
+            </w:pPr>
             <w:r>
               <w:rPr>
                 <w:b w:val="0"/>
@@ -3779,6 +4208,7 @@
           </w:tcPr>
           <w:p>
             <w:pPr>
+              <w:keepNext/>
               <w:jc w:val="center"/>
             </w:pPr>
             <w:r>
@@ -3797,6 +4227,9 @@
             <w:shd w:val="clear" w:color="auto" w:fill="E6E6E6"/>
           </w:tcPr>
           <w:p>
+            <w:pPr>
+              <w:keepNext/>
+            </w:pPr>
             <w:r>
               <w:rPr>
                 <w:b/>
@@ -3814,6 +4247,7 @@
           </w:tcPr>
           <w:p>
             <w:pPr>
+              <w:keepNext/>
               <w:jc w:val="center"/>
             </w:pPr>
             <w:r>
@@ -3832,6 +4266,9 @@
             <w:shd w:val="clear" w:color="auto" w:fill="E6E6E6"/>
           </w:tcPr>
           <w:p>
+            <w:pPr>
+              <w:keepNext/>
+            </w:pPr>
             <w:r>
               <w:rPr>
                 <w:b/>
@@ -3848,6 +4285,9 @@
             <w:shd w:val="clear" w:color="auto" w:fill="E6E6E6"/>
           </w:tcPr>
           <w:p>
+            <w:pPr>
+              <w:keepNext/>
+            </w:pPr>
             <w:r>
               <w:rPr>
                 <w:b/>
@@ -3869,6 +4309,7 @@
           </w:tcPr>
           <w:p>
             <w:pPr>
+              <w:keepNext w:val="0"/>
               <w:jc w:val="center"/>
             </w:pPr>
             <w:r>
@@ -3886,6 +4327,9 @@
             <w:vAlign w:val="center"/>
           </w:tcPr>
           <w:p>
+            <w:pPr>
+              <w:keepNext w:val="0"/>
+            </w:pPr>
             <w:r>
               <w:rPr>
                 <w:b w:val="0"/>
@@ -3902,6 +4346,7 @@
           </w:tcPr>
           <w:p>
             <w:pPr>
+              <w:keepNext w:val="0"/>
               <w:jc w:val="center"/>
             </w:pPr>
             <w:r>
@@ -3919,6 +4364,9 @@
             <w:vAlign w:val="center"/>
           </w:tcPr>
           <w:p>
+            <w:pPr>
+              <w:keepNext w:val="0"/>
+            </w:pPr>
             <w:r>
               <w:rPr>
                 <w:b w:val="0"/>
@@ -3934,6 +4382,9 @@
             <w:vAlign w:val="center"/>
           </w:tcPr>
           <w:p>
+            <w:pPr>
+              <w:keepNext w:val="0"/>
+            </w:pPr>
             <w:r>
               <w:rPr>
                 <w:b w:val="0"/>
@@ -3955,6 +4406,7 @@
           </w:tcPr>
           <w:p>
             <w:pPr>
+              <w:keepNext w:val="0"/>
               <w:jc w:val="center"/>
             </w:pPr>
             <w:r>
@@ -3972,6 +4424,9 @@
             <w:vAlign w:val="center"/>
           </w:tcPr>
           <w:p>
+            <w:pPr>
+              <w:keepNext w:val="0"/>
+            </w:pPr>
             <w:r>
               <w:rPr>
                 <w:b w:val="0"/>
@@ -3988,6 +4443,7 @@
           </w:tcPr>
           <w:p>
             <w:pPr>
+              <w:keepNext w:val="0"/>
               <w:jc w:val="center"/>
             </w:pPr>
             <w:r>
@@ -4005,6 +4461,9 @@
             <w:vAlign w:val="center"/>
           </w:tcPr>
           <w:p>
+            <w:pPr>
+              <w:keepNext w:val="0"/>
+            </w:pPr>
             <w:r>
               <w:rPr>
                 <w:b w:val="0"/>
@@ -4020,6 +4479,9 @@
             <w:vAlign w:val="center"/>
           </w:tcPr>
           <w:p>
+            <w:pPr>
+              <w:keepNext w:val="0"/>
+            </w:pPr>
             <w:r>
               <w:rPr>
                 <w:b w:val="0"/>
@@ -4041,6 +4503,7 @@
           </w:tcPr>
           <w:p>
             <w:pPr>
+              <w:keepNext w:val="0"/>
               <w:jc w:val="center"/>
             </w:pPr>
             <w:r>
@@ -4058,6 +4521,9 @@
             <w:vAlign w:val="center"/>
           </w:tcPr>
           <w:p>
+            <w:pPr>
+              <w:keepNext w:val="0"/>
+            </w:pPr>
             <w:r>
               <w:rPr>
                 <w:b w:val="0"/>
@@ -4074,6 +4540,7 @@
           </w:tcPr>
           <w:p>
             <w:pPr>
+              <w:keepNext w:val="0"/>
               <w:jc w:val="center"/>
             </w:pPr>
             <w:r>
@@ -4091,6 +4558,9 @@
             <w:vAlign w:val="center"/>
           </w:tcPr>
           <w:p>
+            <w:pPr>
+              <w:keepNext w:val="0"/>
+            </w:pPr>
             <w:r>
               <w:rPr>
                 <w:b w:val="0"/>
@@ -4106,6 +4576,9 @@
             <w:vAlign w:val="center"/>
           </w:tcPr>
           <w:p>
+            <w:pPr>
+              <w:keepNext w:val="0"/>
+            </w:pPr>
             <w:r>
               <w:rPr>
                 <w:b w:val="0"/>
@@ -4127,6 +4600,7 @@
           </w:tcPr>
           <w:p>
             <w:pPr>
+              <w:keepNext w:val="0"/>
               <w:jc w:val="center"/>
             </w:pPr>
             <w:r>
@@ -4144,6 +4618,9 @@
             <w:vAlign w:val="center"/>
           </w:tcPr>
           <w:p>
+            <w:pPr>
+              <w:keepNext w:val="0"/>
+            </w:pPr>
             <w:r>
               <w:rPr>
                 <w:b w:val="0"/>
@@ -4160,6 +4637,7 @@
           </w:tcPr>
           <w:p>
             <w:pPr>
+              <w:keepNext w:val="0"/>
               <w:jc w:val="center"/>
             </w:pPr>
             <w:r>
@@ -4177,6 +4655,9 @@
             <w:vAlign w:val="center"/>
           </w:tcPr>
           <w:p>
+            <w:pPr>
+              <w:keepNext w:val="0"/>
+            </w:pPr>
             <w:r>
               <w:rPr>
                 <w:b w:val="0"/>
@@ -4192,6 +4673,9 @@
             <w:vAlign w:val="center"/>
           </w:tcPr>
           <w:p>
+            <w:pPr>
+              <w:keepNext w:val="0"/>
+            </w:pPr>
             <w:r>
               <w:rPr>
                 <w:b w:val="0"/>
@@ -4213,6 +4697,7 @@
           </w:tcPr>
           <w:p>
             <w:pPr>
+              <w:keepNext w:val="0"/>
               <w:jc w:val="center"/>
             </w:pPr>
             <w:r>
@@ -4230,6 +4715,9 @@
             <w:vAlign w:val="center"/>
           </w:tcPr>
           <w:p>
+            <w:pPr>
+              <w:keepNext w:val="0"/>
+            </w:pPr>
             <w:r>
               <w:rPr>
                 <w:b w:val="0"/>
@@ -4246,6 +4734,7 @@
           </w:tcPr>
           <w:p>
             <w:pPr>
+              <w:keepNext w:val="0"/>
               <w:jc w:val="center"/>
             </w:pPr>
             <w:r>
@@ -4263,6 +4752,9 @@
             <w:vAlign w:val="center"/>
           </w:tcPr>
           <w:p>
+            <w:pPr>
+              <w:keepNext w:val="0"/>
+            </w:pPr>
             <w:r>
               <w:rPr>
                 <w:b w:val="0"/>
@@ -4278,6 +4770,9 @@
             <w:vAlign w:val="center"/>
           </w:tcPr>
           <w:p>
+            <w:pPr>
+              <w:keepNext w:val="0"/>
+            </w:pPr>
             <w:r>
               <w:rPr>
                 <w:b w:val="0"/>
@@ -4299,6 +4794,7 @@
           </w:tcPr>
           <w:p>
             <w:pPr>
+              <w:keepNext w:val="0"/>
               <w:jc w:val="center"/>
             </w:pPr>
             <w:r>
@@ -4316,6 +4812,9 @@
             <w:vAlign w:val="center"/>
           </w:tcPr>
           <w:p>
+            <w:pPr>
+              <w:keepNext w:val="0"/>
+            </w:pPr>
             <w:r>
               <w:rPr>
                 <w:b w:val="0"/>
@@ -4332,6 +4831,7 @@
           </w:tcPr>
           <w:p>
             <w:pPr>
+              <w:keepNext w:val="0"/>
               <w:jc w:val="center"/>
             </w:pPr>
             <w:r>
@@ -4349,6 +4849,9 @@
             <w:vAlign w:val="center"/>
           </w:tcPr>
           <w:p>
+            <w:pPr>
+              <w:keepNext w:val="0"/>
+            </w:pPr>
             <w:r>
               <w:rPr>
                 <w:b w:val="0"/>
@@ -4364,6 +4867,9 @@
             <w:vAlign w:val="center"/>
           </w:tcPr>
           <w:p>
+            <w:pPr>
+              <w:keepNext w:val="0"/>
+            </w:pPr>
             <w:r>
               <w:rPr>
                 <w:b w:val="0"/>
@@ -4385,6 +4891,7 @@
           </w:tcPr>
           <w:p>
             <w:pPr>
+              <w:keepNext w:val="0"/>
               <w:jc w:val="center"/>
             </w:pPr>
             <w:r>
@@ -4402,6 +4909,9 @@
             <w:vAlign w:val="center"/>
           </w:tcPr>
           <w:p>
+            <w:pPr>
+              <w:keepNext w:val="0"/>
+            </w:pPr>
             <w:r>
               <w:rPr>
                 <w:b w:val="0"/>
@@ -4418,6 +4928,7 @@
           </w:tcPr>
           <w:p>
             <w:pPr>
+              <w:keepNext w:val="0"/>
               <w:jc w:val="center"/>
             </w:pPr>
             <w:r>
@@ -4435,6 +4946,9 @@
             <w:vAlign w:val="center"/>
           </w:tcPr>
           <w:p>
+            <w:pPr>
+              <w:keepNext w:val="0"/>
+            </w:pPr>
             <w:r>
               <w:rPr>
                 <w:b w:val="0"/>
@@ -4450,6 +4964,9 @@
             <w:vAlign w:val="center"/>
           </w:tcPr>
           <w:p>
+            <w:pPr>
+              <w:keepNext w:val="0"/>
+            </w:pPr>
             <w:r>
               <w:rPr>
                 <w:b w:val="0"/>
@@ -4471,6 +4988,7 @@
           </w:tcPr>
           <w:p>
             <w:pPr>
+              <w:keepNext w:val="0"/>
               <w:jc w:val="center"/>
             </w:pPr>
             <w:r>
@@ -4488,6 +5006,9 @@
             <w:vAlign w:val="center"/>
           </w:tcPr>
           <w:p>
+            <w:pPr>
+              <w:keepNext w:val="0"/>
+            </w:pPr>
             <w:r>
               <w:rPr>
                 <w:b w:val="0"/>
@@ -4504,6 +5025,7 @@
           </w:tcPr>
           <w:p>
             <w:pPr>
+              <w:keepNext w:val="0"/>
               <w:jc w:val="center"/>
             </w:pPr>
             <w:r>
@@ -4521,6 +5043,9 @@
             <w:vAlign w:val="center"/>
           </w:tcPr>
           <w:p>
+            <w:pPr>
+              <w:keepNext w:val="0"/>
+            </w:pPr>
             <w:r>
               <w:rPr>
                 <w:b w:val="0"/>
@@ -4536,6 +5061,9 @@
             <w:vAlign w:val="center"/>
           </w:tcPr>
           <w:p>
+            <w:pPr>
+              <w:keepNext w:val="0"/>
+            </w:pPr>
             <w:r>
               <w:rPr>
                 <w:b w:val="0"/>
@@ -4557,6 +5085,7 @@
           </w:tcPr>
           <w:p>
             <w:pPr>
+              <w:keepNext w:val="0"/>
               <w:jc w:val="center"/>
             </w:pPr>
             <w:r>
@@ -4574,6 +5103,9 @@
             <w:vAlign w:val="center"/>
           </w:tcPr>
           <w:p>
+            <w:pPr>
+              <w:keepNext w:val="0"/>
+            </w:pPr>
             <w:r>
               <w:rPr>
                 <w:b w:val="0"/>
@@ -4590,6 +5122,7 @@
           </w:tcPr>
           <w:p>
             <w:pPr>
+              <w:keepNext w:val="0"/>
               <w:jc w:val="center"/>
             </w:pPr>
             <w:r>
@@ -4607,6 +5140,9 @@
             <w:vAlign w:val="center"/>
           </w:tcPr>
           <w:p>
+            <w:pPr>
+              <w:keepNext w:val="0"/>
+            </w:pPr>
             <w:r>
               <w:rPr>
                 <w:b w:val="0"/>
@@ -4622,6 +5158,9 @@
             <w:vAlign w:val="center"/>
           </w:tcPr>
           <w:p>
+            <w:pPr>
+              <w:keepNext w:val="0"/>
+            </w:pPr>
             <w:r>
               <w:rPr>
                 <w:b w:val="0"/>
@@ -4643,6 +5182,7 @@
           </w:tcPr>
           <w:p>
             <w:pPr>
+              <w:keepNext w:val="0"/>
               <w:jc w:val="center"/>
             </w:pPr>
             <w:r>
@@ -4660,6 +5200,9 @@
             <w:vAlign w:val="center"/>
           </w:tcPr>
           <w:p>
+            <w:pPr>
+              <w:keepNext w:val="0"/>
+            </w:pPr>
             <w:r>
               <w:rPr>
                 <w:b w:val="0"/>
@@ -4676,6 +5219,7 @@
           </w:tcPr>
           <w:p>
             <w:pPr>
+              <w:keepNext w:val="0"/>
               <w:jc w:val="center"/>
             </w:pPr>
             <w:r>
@@ -4693,6 +5237,9 @@
             <w:vAlign w:val="center"/>
           </w:tcPr>
           <w:p>
+            <w:pPr>
+              <w:keepNext w:val="0"/>
+            </w:pPr>
             <w:r>
               <w:rPr>
                 <w:b w:val="0"/>
@@ -4708,6 +5255,9 @@
             <w:vAlign w:val="center"/>
           </w:tcPr>
           <w:p>
+            <w:pPr>
+              <w:keepNext w:val="0"/>
+            </w:pPr>
             <w:r>
               <w:rPr>
                 <w:b w:val="0"/>
@@ -4729,6 +5279,7 @@
           </w:tcPr>
           <w:p>
             <w:pPr>
+              <w:keepNext w:val="0"/>
               <w:jc w:val="center"/>
             </w:pPr>
             <w:r>
@@ -4746,6 +5297,9 @@
             <w:vAlign w:val="center"/>
           </w:tcPr>
           <w:p>
+            <w:pPr>
+              <w:keepNext w:val="0"/>
+            </w:pPr>
             <w:r>
               <w:rPr>
                 <w:b w:val="0"/>
@@ -4762,6 +5316,7 @@
           </w:tcPr>
           <w:p>
             <w:pPr>
+              <w:keepNext w:val="0"/>
               <w:jc w:val="center"/>
             </w:pPr>
             <w:r>
@@ -4779,6 +5334,9 @@
             <w:vAlign w:val="center"/>
           </w:tcPr>
           <w:p>
+            <w:pPr>
+              <w:keepNext w:val="0"/>
+            </w:pPr>
             <w:r>
               <w:rPr>
                 <w:b w:val="0"/>
@@ -4794,6 +5352,9 @@
             <w:vAlign w:val="center"/>
           </w:tcPr>
           <w:p>
+            <w:pPr>
+              <w:keepNext w:val="0"/>
+            </w:pPr>
             <w:r>
               <w:rPr>
                 <w:b w:val="0"/>
@@ -4851,6 +5412,7 @@
           </w:tcPr>
           <w:p>
             <w:pPr>
+              <w:keepNext/>
               <w:jc w:val="center"/>
             </w:pPr>
             <w:r>
@@ -4869,6 +5431,9 @@
             <w:shd w:val="clear" w:color="auto" w:fill="E6E6E6"/>
           </w:tcPr>
           <w:p>
+            <w:pPr>
+              <w:keepNext/>
+            </w:pPr>
             <w:r>
               <w:rPr>
                 <w:b/>
@@ -4886,6 +5451,7 @@
           </w:tcPr>
           <w:p>
             <w:pPr>
+              <w:keepNext/>
               <w:jc w:val="center"/>
             </w:pPr>
             <w:r>
@@ -4904,6 +5470,9 @@
             <w:shd w:val="clear" w:color="auto" w:fill="E6E6E6"/>
           </w:tcPr>
           <w:p>
+            <w:pPr>
+              <w:keepNext/>
+            </w:pPr>
             <w:r>
               <w:rPr>
                 <w:b/>
@@ -4920,6 +5489,9 @@
             <w:shd w:val="clear" w:color="auto" w:fill="E6E6E6"/>
           </w:tcPr>
           <w:p>
+            <w:pPr>
+              <w:keepNext/>
+            </w:pPr>
             <w:r>
               <w:rPr>
                 <w:b/>
@@ -4941,6 +5513,7 @@
           </w:tcPr>
           <w:p>
             <w:pPr>
+              <w:keepNext w:val="0"/>
               <w:jc w:val="center"/>
             </w:pPr>
             <w:r>
@@ -4958,6 +5531,9 @@
             <w:vAlign w:val="center"/>
           </w:tcPr>
           <w:p>
+            <w:pPr>
+              <w:keepNext w:val="0"/>
+            </w:pPr>
             <w:r>
               <w:rPr>
                 <w:b w:val="0"/>
@@ -4974,6 +5550,7 @@
           </w:tcPr>
           <w:p>
             <w:pPr>
+              <w:keepNext w:val="0"/>
               <w:jc w:val="center"/>
             </w:pPr>
             <w:r>
@@ -4991,6 +5568,9 @@
             <w:vAlign w:val="center"/>
           </w:tcPr>
           <w:p>
+            <w:pPr>
+              <w:keepNext w:val="0"/>
+            </w:pPr>
             <w:r>
               <w:rPr>
                 <w:b w:val="0"/>
@@ -5006,6 +5586,9 @@
             <w:vAlign w:val="center"/>
           </w:tcPr>
           <w:p>
+            <w:pPr>
+              <w:keepNext w:val="0"/>
+            </w:pPr>
             <w:r>
               <w:rPr>
                 <w:b w:val="0"/>
@@ -5027,6 +5610,7 @@
           </w:tcPr>
           <w:p>
             <w:pPr>
+              <w:keepNext w:val="0"/>
               <w:jc w:val="center"/>
             </w:pPr>
             <w:r>
@@ -5044,6 +5628,9 @@
             <w:vAlign w:val="center"/>
           </w:tcPr>
           <w:p>
+            <w:pPr>
+              <w:keepNext w:val="0"/>
+            </w:pPr>
             <w:r>
               <w:rPr>
                 <w:b w:val="0"/>
@@ -5060,6 +5647,7 @@
           </w:tcPr>
           <w:p>
             <w:pPr>
+              <w:keepNext w:val="0"/>
               <w:jc w:val="center"/>
             </w:pPr>
             <w:r>
@@ -5077,6 +5665,9 @@
             <w:vAlign w:val="center"/>
           </w:tcPr>
           <w:p>
+            <w:pPr>
+              <w:keepNext w:val="0"/>
+            </w:pPr>
             <w:r>
               <w:rPr>
                 <w:b w:val="0"/>
@@ -5092,6 +5683,9 @@
             <w:vAlign w:val="center"/>
           </w:tcPr>
           <w:p>
+            <w:pPr>
+              <w:keepNext w:val="0"/>
+            </w:pPr>
             <w:r>
               <w:rPr>
                 <w:b w:val="0"/>
@@ -5113,6 +5707,7 @@
           </w:tcPr>
           <w:p>
             <w:pPr>
+              <w:keepNext w:val="0"/>
               <w:jc w:val="center"/>
             </w:pPr>
             <w:r>
@@ -5130,6 +5725,9 @@
             <w:vAlign w:val="center"/>
           </w:tcPr>
           <w:p>
+            <w:pPr>
+              <w:keepNext w:val="0"/>
+            </w:pPr>
             <w:r>
               <w:rPr>
                 <w:b w:val="0"/>
@@ -5146,6 +5744,7 @@
           </w:tcPr>
           <w:p>
             <w:pPr>
+              <w:keepNext w:val="0"/>
               <w:jc w:val="center"/>
             </w:pPr>
             <w:r>
@@ -5163,6 +5762,9 @@
             <w:vAlign w:val="center"/>
           </w:tcPr>
           <w:p>
+            <w:pPr>
+              <w:keepNext w:val="0"/>
+            </w:pPr>
             <w:r>
               <w:rPr>
                 <w:b w:val="0"/>
@@ -5178,6 +5780,9 @@
             <w:vAlign w:val="center"/>
           </w:tcPr>
           <w:p>
+            <w:pPr>
+              <w:keepNext w:val="0"/>
+            </w:pPr>
             <w:r>
               <w:rPr>
                 <w:b w:val="0"/>
@@ -5199,6 +5804,7 @@
           </w:tcPr>
           <w:p>
             <w:pPr>
+              <w:keepNext w:val="0"/>
               <w:jc w:val="center"/>
             </w:pPr>
             <w:r>
@@ -5216,6 +5822,9 @@
             <w:vAlign w:val="center"/>
           </w:tcPr>
           <w:p>
+            <w:pPr>
+              <w:keepNext w:val="0"/>
+            </w:pPr>
             <w:r>
               <w:rPr>
                 <w:b w:val="0"/>
@@ -5232,6 +5841,7 @@
           </w:tcPr>
           <w:p>
             <w:pPr>
+              <w:keepNext w:val="0"/>
               <w:jc w:val="center"/>
             </w:pPr>
             <w:r>
@@ -5249,6 +5859,9 @@
             <w:vAlign w:val="center"/>
           </w:tcPr>
           <w:p>
+            <w:pPr>
+              <w:keepNext w:val="0"/>
+            </w:pPr>
             <w:r>
               <w:rPr>
                 <w:b w:val="0"/>
@@ -5264,6 +5877,9 @@
             <w:vAlign w:val="center"/>
           </w:tcPr>
           <w:p>
+            <w:pPr>
+              <w:keepNext w:val="0"/>
+            </w:pPr>
             <w:r>
               <w:rPr>
                 <w:b w:val="0"/>
@@ -5285,6 +5901,7 @@
           </w:tcPr>
           <w:p>
             <w:pPr>
+              <w:keepNext w:val="0"/>
               <w:jc w:val="center"/>
             </w:pPr>
             <w:r>
@@ -5302,6 +5919,9 @@
             <w:vAlign w:val="center"/>
           </w:tcPr>
           <w:p>
+            <w:pPr>
+              <w:keepNext w:val="0"/>
+            </w:pPr>
             <w:r>
               <w:rPr>
                 <w:b w:val="0"/>
@@ -5318,6 +5938,7 @@
           </w:tcPr>
           <w:p>
             <w:pPr>
+              <w:keepNext w:val="0"/>
               <w:jc w:val="center"/>
             </w:pPr>
             <w:r>
@@ -5335,6 +5956,9 @@
             <w:vAlign w:val="center"/>
           </w:tcPr>
           <w:p>
+            <w:pPr>
+              <w:keepNext w:val="0"/>
+            </w:pPr>
             <w:r>
               <w:rPr>
                 <w:b w:val="0"/>
@@ -5350,6 +5974,9 @@
             <w:vAlign w:val="center"/>
           </w:tcPr>
           <w:p>
+            <w:pPr>
+              <w:keepNext w:val="0"/>
+            </w:pPr>
             <w:r>
               <w:rPr>
                 <w:b w:val="0"/>
@@ -5371,6 +5998,7 @@
           </w:tcPr>
           <w:p>
             <w:pPr>
+              <w:keepNext w:val="0"/>
               <w:jc w:val="center"/>
             </w:pPr>
             <w:r>
@@ -5388,6 +6016,9 @@
             <w:vAlign w:val="center"/>
           </w:tcPr>
           <w:p>
+            <w:pPr>
+              <w:keepNext w:val="0"/>
+            </w:pPr>
             <w:r>
               <w:rPr>
                 <w:b w:val="0"/>
@@ -5404,6 +6035,7 @@
           </w:tcPr>
           <w:p>
             <w:pPr>
+              <w:keepNext w:val="0"/>
               <w:jc w:val="center"/>
             </w:pPr>
             <w:r>
@@ -5421,6 +6053,9 @@
             <w:vAlign w:val="center"/>
           </w:tcPr>
           <w:p>
+            <w:pPr>
+              <w:keepNext w:val="0"/>
+            </w:pPr>
             <w:r>
               <w:rPr>
                 <w:b w:val="0"/>
@@ -5436,6 +6071,9 @@
             <w:vAlign w:val="center"/>
           </w:tcPr>
           <w:p>
+            <w:pPr>
+              <w:keepNext w:val="0"/>
+            </w:pPr>
             <w:r>
               <w:rPr>
                 <w:b w:val="0"/>
@@ -5457,6 +6095,7 @@
           </w:tcPr>
           <w:p>
             <w:pPr>
+              <w:keepNext w:val="0"/>
               <w:jc w:val="center"/>
             </w:pPr>
             <w:r>
@@ -5474,6 +6113,9 @@
             <w:vAlign w:val="center"/>
           </w:tcPr>
           <w:p>
+            <w:pPr>
+              <w:keepNext w:val="0"/>
+            </w:pPr>
             <w:r>
               <w:rPr>
                 <w:b w:val="0"/>
@@ -5490,6 +6132,7 @@
           </w:tcPr>
           <w:p>
             <w:pPr>
+              <w:keepNext w:val="0"/>
               <w:jc w:val="center"/>
             </w:pPr>
             <w:r>
@@ -5507,6 +6150,9 @@
             <w:vAlign w:val="center"/>
           </w:tcPr>
           <w:p>
+            <w:pPr>
+              <w:keepNext w:val="0"/>
+            </w:pPr>
             <w:r>
               <w:rPr>
                 <w:b w:val="0"/>
@@ -5522,6 +6168,9 @@
             <w:vAlign w:val="center"/>
           </w:tcPr>
           <w:p>
+            <w:pPr>
+              <w:keepNext w:val="0"/>
+            </w:pPr>
             <w:r>
               <w:rPr>
                 <w:b w:val="0"/>
@@ -5579,6 +6228,7 @@
           </w:tcPr>
           <w:p>
             <w:pPr>
+              <w:keepNext/>
               <w:jc w:val="center"/>
             </w:pPr>
             <w:r>
@@ -5597,6 +6247,9 @@
             <w:shd w:val="clear" w:color="auto" w:fill="E6E6E6"/>
           </w:tcPr>
           <w:p>
+            <w:pPr>
+              <w:keepNext/>
+            </w:pPr>
             <w:r>
               <w:rPr>
                 <w:b/>
@@ -5614,6 +6267,7 @@
           </w:tcPr>
           <w:p>
             <w:pPr>
+              <w:keepNext/>
               <w:jc w:val="center"/>
             </w:pPr>
             <w:r>
@@ -5632,6 +6286,9 @@
             <w:shd w:val="clear" w:color="auto" w:fill="E6E6E6"/>
           </w:tcPr>
           <w:p>
+            <w:pPr>
+              <w:keepNext/>
+            </w:pPr>
             <w:r>
               <w:rPr>
                 <w:b/>
@@ -5648,6 +6305,9 @@
             <w:shd w:val="clear" w:color="auto" w:fill="E6E6E6"/>
           </w:tcPr>
           <w:p>
+            <w:pPr>
+              <w:keepNext/>
+            </w:pPr>
             <w:r>
               <w:rPr>
                 <w:b/>
@@ -5669,6 +6329,7 @@
           </w:tcPr>
           <w:p>
             <w:pPr>
+              <w:keepNext w:val="0"/>
               <w:jc w:val="center"/>
             </w:pPr>
             <w:r>
@@ -5686,6 +6347,9 @@
             <w:vAlign w:val="center"/>
           </w:tcPr>
           <w:p>
+            <w:pPr>
+              <w:keepNext w:val="0"/>
+            </w:pPr>
             <w:r>
               <w:rPr>
                 <w:b w:val="0"/>
@@ -5702,6 +6366,7 @@
           </w:tcPr>
           <w:p>
             <w:pPr>
+              <w:keepNext w:val="0"/>
               <w:jc w:val="center"/>
             </w:pPr>
             <w:r>
@@ -5719,6 +6384,9 @@
             <w:vAlign w:val="center"/>
           </w:tcPr>
           <w:p>
+            <w:pPr>
+              <w:keepNext w:val="0"/>
+            </w:pPr>
             <w:r>
               <w:rPr>
                 <w:b w:val="0"/>
@@ -5734,6 +6402,9 @@
             <w:vAlign w:val="center"/>
           </w:tcPr>
           <w:p>
+            <w:pPr>
+              <w:keepNext w:val="0"/>
+            </w:pPr>
             <w:r>
               <w:rPr>
                 <w:b w:val="0"/>
@@ -5755,6 +6426,7 @@
           </w:tcPr>
           <w:p>
             <w:pPr>
+              <w:keepNext w:val="0"/>
               <w:jc w:val="center"/>
             </w:pPr>
             <w:r>
@@ -5772,6 +6444,9 @@
             <w:vAlign w:val="center"/>
           </w:tcPr>
           <w:p>
+            <w:pPr>
+              <w:keepNext w:val="0"/>
+            </w:pPr>
             <w:r>
               <w:rPr>
                 <w:b w:val="0"/>
@@ -5788,6 +6463,7 @@
           </w:tcPr>
           <w:p>
             <w:pPr>
+              <w:keepNext w:val="0"/>
               <w:jc w:val="center"/>
             </w:pPr>
             <w:r>
@@ -5805,6 +6481,9 @@
             <w:vAlign w:val="center"/>
           </w:tcPr>
           <w:p>
+            <w:pPr>
+              <w:keepNext w:val="0"/>
+            </w:pPr>
             <w:r>
               <w:rPr>
                 <w:b w:val="0"/>
@@ -5820,6 +6499,9 @@
             <w:vAlign w:val="center"/>
           </w:tcPr>
           <w:p>
+            <w:pPr>
+              <w:keepNext w:val="0"/>
+            </w:pPr>
             <w:r>
               <w:rPr>
                 <w:b w:val="0"/>
@@ -5841,6 +6523,7 @@
           </w:tcPr>
           <w:p>
             <w:pPr>
+              <w:keepNext w:val="0"/>
               <w:jc w:val="center"/>
             </w:pPr>
             <w:r>
@@ -5858,6 +6541,9 @@
             <w:vAlign w:val="center"/>
           </w:tcPr>
           <w:p>
+            <w:pPr>
+              <w:keepNext w:val="0"/>
+            </w:pPr>
             <w:r>
               <w:rPr>
                 <w:b w:val="0"/>
@@ -5874,6 +6560,7 @@
           </w:tcPr>
           <w:p>
             <w:pPr>
+              <w:keepNext w:val="0"/>
               <w:jc w:val="center"/>
             </w:pPr>
             <w:r>
@@ -5891,6 +6578,9 @@
             <w:vAlign w:val="center"/>
           </w:tcPr>
           <w:p>
+            <w:pPr>
+              <w:keepNext w:val="0"/>
+            </w:pPr>
             <w:r>
               <w:rPr>
                 <w:b w:val="0"/>
@@ -5906,6 +6596,9 @@
             <w:vAlign w:val="center"/>
           </w:tcPr>
           <w:p>
+            <w:pPr>
+              <w:keepNext w:val="0"/>
+            </w:pPr>
             <w:r>
               <w:rPr>
                 <w:b w:val="0"/>
@@ -5962,6 +6655,7 @@
           </w:tcPr>
           <w:p>
             <w:pPr>
+              <w:keepNext/>
               <w:jc w:val="center"/>
             </w:pPr>
             <w:r>
@@ -5980,6 +6674,9 @@
             <w:shd w:val="clear" w:color="auto" w:fill="E6E6E6"/>
           </w:tcPr>
           <w:p>
+            <w:pPr>
+              <w:keepNext/>
+            </w:pPr>
             <w:r>
               <w:rPr>
                 <w:b/>
@@ -5997,6 +6694,7 @@
           </w:tcPr>
           <w:p>
             <w:pPr>
+              <w:keepNext/>
               <w:jc w:val="center"/>
             </w:pPr>
             <w:r>
@@ -6016,6 +6714,7 @@
           </w:tcPr>
           <w:p>
             <w:pPr>
+              <w:keepNext/>
               <w:jc w:val="center"/>
             </w:pPr>
             <w:r>
@@ -6039,6 +6738,7 @@
           </w:tcPr>
           <w:p>
             <w:pPr>
+              <w:keepNext w:val="0"/>
               <w:jc w:val="center"/>
             </w:pPr>
             <w:r>
@@ -6056,6 +6756,9 @@
             <w:vAlign w:val="center"/>
           </w:tcPr>
           <w:p>
+            <w:pPr>
+              <w:keepNext w:val="0"/>
+            </w:pPr>
             <w:r>
               <w:rPr>
                 <w:b w:val="0"/>
@@ -6072,6 +6775,7 @@
           </w:tcPr>
           <w:p>
             <w:pPr>
+              <w:keepNext w:val="0"/>
               <w:jc w:val="center"/>
             </w:pPr>
             <w:r>
@@ -6090,6 +6794,7 @@
           </w:tcPr>
           <w:p>
             <w:pPr>
+              <w:keepNext w:val="0"/>
               <w:jc w:val="center"/>
             </w:pPr>
             <w:r>
@@ -6113,6 +6818,7 @@
           </w:tcPr>
           <w:p>
             <w:pPr>
+              <w:keepNext w:val="0"/>
               <w:jc w:val="center"/>
             </w:pPr>
             <w:r>
@@ -6130,6 +6836,9 @@
             <w:vAlign w:val="center"/>
           </w:tcPr>
           <w:p>
+            <w:pPr>
+              <w:keepNext w:val="0"/>
+            </w:pPr>
             <w:r>
               <w:rPr>
                 <w:b w:val="0"/>
@@ -6146,6 +6855,7 @@
           </w:tcPr>
           <w:p>
             <w:pPr>
+              <w:keepNext w:val="0"/>
               <w:jc w:val="center"/>
             </w:pPr>
             <w:r>
@@ -6164,6 +6874,7 @@
           </w:tcPr>
           <w:p>
             <w:pPr>
+              <w:keepNext w:val="0"/>
               <w:jc w:val="center"/>
             </w:pPr>
             <w:r>
@@ -6187,6 +6898,7 @@
           </w:tcPr>
           <w:p>
             <w:pPr>
+              <w:keepNext w:val="0"/>
               <w:jc w:val="center"/>
             </w:pPr>
             <w:r>
@@ -6204,6 +6916,9 @@
             <w:vAlign w:val="center"/>
           </w:tcPr>
           <w:p>
+            <w:pPr>
+              <w:keepNext w:val="0"/>
+            </w:pPr>
             <w:r>
               <w:rPr>
                 <w:b w:val="0"/>
@@ -6220,6 +6935,7 @@
           </w:tcPr>
           <w:p>
             <w:pPr>
+              <w:keepNext w:val="0"/>
               <w:jc w:val="center"/>
             </w:pPr>
             <w:r>
@@ -6238,6 +6954,7 @@
           </w:tcPr>
           <w:p>
             <w:pPr>
+              <w:keepNext w:val="0"/>
               <w:jc w:val="center"/>
             </w:pPr>
             <w:r>
@@ -6261,6 +6978,7 @@
           </w:tcPr>
           <w:p>
             <w:pPr>
+              <w:keepNext w:val="0"/>
               <w:jc w:val="center"/>
             </w:pPr>
             <w:r>
@@ -6278,6 +6996,9 @@
             <w:vAlign w:val="center"/>
           </w:tcPr>
           <w:p>
+            <w:pPr>
+              <w:keepNext w:val="0"/>
+            </w:pPr>
             <w:r>
               <w:rPr>
                 <w:b w:val="0"/>
@@ -6294,6 +7015,7 @@
           </w:tcPr>
           <w:p>
             <w:pPr>
+              <w:keepNext w:val="0"/>
               <w:jc w:val="center"/>
             </w:pPr>
             <w:r>
@@ -6312,6 +7034,7 @@
           </w:tcPr>
           <w:p>
             <w:pPr>
+              <w:keepNext w:val="0"/>
               <w:jc w:val="center"/>
             </w:pPr>
             <w:r>
@@ -6335,6 +7058,7 @@
           </w:tcPr>
           <w:p>
             <w:pPr>
+              <w:keepNext w:val="0"/>
               <w:jc w:val="center"/>
             </w:pPr>
             <w:r>
@@ -6352,6 +7076,9 @@
             <w:vAlign w:val="center"/>
           </w:tcPr>
           <w:p>
+            <w:pPr>
+              <w:keepNext w:val="0"/>
+            </w:pPr>
             <w:r>
               <w:rPr>
                 <w:b w:val="0"/>
@@ -6368,6 +7095,7 @@
           </w:tcPr>
           <w:p>
             <w:pPr>
+              <w:keepNext w:val="0"/>
               <w:jc w:val="center"/>
             </w:pPr>
             <w:r>
@@ -6386,6 +7114,7 @@
           </w:tcPr>
           <w:p>
             <w:pPr>
+              <w:keepNext w:val="0"/>
               <w:jc w:val="center"/>
             </w:pPr>
             <w:r>
@@ -6409,6 +7138,7 @@
           </w:tcPr>
           <w:p>
             <w:pPr>
+              <w:keepNext w:val="0"/>
               <w:jc w:val="center"/>
             </w:pPr>
             <w:r>
@@ -6426,6 +7156,9 @@
             <w:vAlign w:val="center"/>
           </w:tcPr>
           <w:p>
+            <w:pPr>
+              <w:keepNext w:val="0"/>
+            </w:pPr>
             <w:r>
               <w:rPr>
                 <w:b w:val="0"/>
@@ -6442,6 +7175,7 @@
           </w:tcPr>
           <w:p>
             <w:pPr>
+              <w:keepNext w:val="0"/>
               <w:jc w:val="center"/>
             </w:pPr>
             <w:r>
@@ -6460,6 +7194,7 @@
           </w:tcPr>
           <w:p>
             <w:pPr>
+              <w:keepNext w:val="0"/>
               <w:jc w:val="center"/>
             </w:pPr>
             <w:r>
@@ -6483,6 +7218,7 @@
           </w:tcPr>
           <w:p>
             <w:pPr>
+              <w:keepNext w:val="0"/>
               <w:jc w:val="center"/>
             </w:pPr>
             <w:r>
@@ -6500,6 +7236,9 @@
             <w:vAlign w:val="center"/>
           </w:tcPr>
           <w:p>
+            <w:pPr>
+              <w:keepNext w:val="0"/>
+            </w:pPr>
             <w:r>
               <w:rPr>
                 <w:b w:val="0"/>
@@ -6516,6 +7255,7 @@
           </w:tcPr>
           <w:p>
             <w:pPr>
+              <w:keepNext w:val="0"/>
               <w:jc w:val="center"/>
             </w:pPr>
             <w:r>
@@ -6534,6 +7274,7 @@
           </w:tcPr>
           <w:p>
             <w:pPr>
+              <w:keepNext w:val="0"/>
               <w:jc w:val="center"/>
             </w:pPr>
             <w:r>
@@ -6557,6 +7298,7 @@
           </w:tcPr>
           <w:p>
             <w:pPr>
+              <w:keepNext w:val="0"/>
               <w:jc w:val="center"/>
             </w:pPr>
             <w:r>
@@ -6573,6 +7315,9 @@
             <w:vAlign w:val="center"/>
           </w:tcPr>
           <w:p>
+            <w:pPr>
+              <w:keepNext w:val="0"/>
+            </w:pPr>
             <w:r>
               <w:rPr>
                 <w:b/>
@@ -6589,6 +7334,7 @@
           </w:tcPr>
           <w:p>
             <w:pPr>
+              <w:keepNext w:val="0"/>
               <w:jc w:val="center"/>
             </w:pPr>
             <w:r>
@@ -6607,6 +7353,7 @@
           </w:tcPr>
           <w:p>
             <w:pPr>
+              <w:keepNext w:val="0"/>
               <w:jc w:val="center"/>
             </w:pPr>
             <w:r>

</xml_diff>